<commit_message>
Match exam page breaks and headers to the uploaded unit JPG layout.
Generate each source page as its own clear Word/PDF then merge, so U1–U5 pagination follows pages-hd instead of reflowing into a redesigned layout.

Co-authored-by: Cursor <cursoragent@cursor.com>
</commit_message>
<xml_diff>
--- a/printables/u01/04-考前测试/U1_四上_第一单元_大数的认识_答案.docx
+++ b/printables/u01/04-考前测试/U1_四上_第一单元_大数的认识_答案.docx
@@ -2,21 +2,6 @@
 <file path=word/document.xml><?xml version="1.0" encoding="utf-8"?>
 <w:document xmlns:wpc="http://schemas.microsoft.com/office/word/2010/wordprocessingCanvas" xmlns:mo="http://schemas.microsoft.com/office/mac/office/2008/main" xmlns:mc="http://schemas.openxmlformats.org/markup-compatibility/2006" xmlns:mv="urn:schemas-microsoft-com:mac:vml" xmlns:o="urn:schemas-microsoft-com:office:office" xmlns:r="http://schemas.openxmlformats.org/officeDocument/2006/relationships" xmlns:m="http://schemas.openxmlformats.org/officeDocument/2006/math" xmlns:v="urn:schemas-microsoft-com:vml" xmlns:wp14="http://schemas.microsoft.com/office/word/2010/wordprocessingDrawing" xmlns:wp="http://schemas.openxmlformats.org/drawingml/2006/wordprocessingDrawing" xmlns:w10="urn:schemas-microsoft-com:office:word" xmlns:w="http://schemas.openxmlformats.org/wordprocessingml/2006/main" xmlns:w14="http://schemas.microsoft.com/office/word/2010/wordml" xmlns:wpg="http://schemas.microsoft.com/office/word/2010/wordprocessingGroup" xmlns:wpi="http://schemas.microsoft.com/office/word/2010/wordprocessingInk" xmlns:wne="http://schemas.microsoft.com/office/word/2006/wordml" xmlns:wps="http://schemas.microsoft.com/office/word/2010/wordprocessingShape" mc:Ignorable="w14 wp14">
   <w:body>
-    <w:p>
-      <w:pPr>
-        <w:spacing w:before="0" w:after="40" w:line="240" w:lineRule="auto"/>
-        <w:jc w:val="center"/>
-      </w:pPr>
-      <w:r>
-        <w:rPr>
-          <w:rFonts w:ascii="宋体" w:hAnsi="宋体" w:eastAsia="宋体"/>
-          <w:b w:val="0"/>
-          <w:color w:val="1E7EB8"/>
-          <w:sz w:val="20"/>
-        </w:rPr>
-        <w:t>数学书桌 · Math Desk</w:t>
-      </w:r>
-    </w:p>
     <w:p>
       <w:pPr>
         <w:spacing w:before="0" w:after="80" w:line="240" w:lineRule="auto"/>
@@ -43,12 +28,12 @@
           <w:b w:val="0"/>
           <w:sz w:val="20"/>
         </w:rPr>
-        <w:t>单独答案页 · 可只打印这一页　|　清晰文字版</w:t>
+        <w:t>单独答案页 · 可只打印这一页</w:t>
       </w:r>
     </w:p>
     <w:p>
       <w:pPr>
-        <w:spacing w:before="120" w:after="80" w:line="240" w:lineRule="auto"/>
+        <w:spacing w:before="100" w:after="60" w:line="240" w:lineRule="auto"/>
       </w:pPr>
       <w:r>
         <w:rPr>
@@ -62,7 +47,7 @@
     </w:p>
     <w:p>
       <w:pPr>
-        <w:spacing w:before="120" w:after="80" w:line="240" w:lineRule="auto"/>
+        <w:spacing w:before="100" w:after="60" w:line="240" w:lineRule="auto"/>
       </w:pPr>
       <w:r>
         <w:rPr>
@@ -258,7 +243,7 @@
     </w:p>
     <w:p>
       <w:pPr>
-        <w:spacing w:before="120" w:after="80" w:line="240" w:lineRule="auto"/>
+        <w:spacing w:before="100" w:after="60" w:line="240" w:lineRule="auto"/>
       </w:pPr>
       <w:r>
         <w:rPr>
@@ -376,7 +361,7 @@
     </w:p>
     <w:p>
       <w:pPr>
-        <w:spacing w:before="120" w:after="80" w:line="240" w:lineRule="auto"/>
+        <w:spacing w:before="100" w:after="60" w:line="240" w:lineRule="auto"/>
       </w:pPr>
       <w:r>
         <w:rPr>
@@ -507,7 +492,7 @@
     </w:p>
     <w:p>
       <w:pPr>
-        <w:spacing w:before="120" w:after="80" w:line="240" w:lineRule="auto"/>
+        <w:spacing w:before="100" w:after="60" w:line="240" w:lineRule="auto"/>
       </w:pPr>
       <w:r>
         <w:rPr>
@@ -573,7 +558,7 @@
     </w:p>
     <w:p>
       <w:pPr>
-        <w:spacing w:before="120" w:after="80" w:line="240" w:lineRule="auto"/>
+        <w:spacing w:before="100" w:after="60" w:line="240" w:lineRule="auto"/>
       </w:pPr>
       <w:r>
         <w:rPr>
@@ -665,7 +650,7 @@
     </w:p>
     <w:p>
       <w:pPr>
-        <w:spacing w:before="120" w:after="80" w:line="240" w:lineRule="auto"/>
+        <w:spacing w:before="100" w:after="60" w:line="240" w:lineRule="auto"/>
       </w:pPr>
       <w:r>
         <w:rPr>
@@ -705,7 +690,7 @@
     </w:p>
     <w:sectPr>
       <w:pgSz w:w="11906" w:h="16838"/>
-      <w:pgMar w:top="794" w:right="907" w:bottom="794" w:left="907" w:header="720" w:footer="720" w:gutter="0"/>
+      <w:pgMar w:top="794" w:right="1020" w:bottom="794" w:left="1020" w:header="720" w:footer="720" w:gutter="0"/>
       <w:cols w:space="720"/>
       <w:docGrid w:linePitch="360"/>
     </w:sectPr>

</xml_diff>

<commit_message>
Remake U1-U5 pretest papers as clear A4 Word/PDF matching original layout.
Keep page breaks and density from source photos; redraw diagrams, drop blank placeholder pages for U3-U5 (2-page originals).

Co-authored-by: Cursor <cursoragent@cursor.com>
</commit_message>
<xml_diff>
--- a/printables/u01/04-考前测试/U1_四上_第一单元_大数的认识_答案.docx
+++ b/printables/u01/04-考前测试/U1_四上_第一单元_大数的认识_答案.docx
@@ -4,693 +4,685 @@
   <w:body>
     <w:p>
       <w:pPr>
-        <w:spacing w:before="0" w:after="80" w:line="240" w:lineRule="auto"/>
+        <w:spacing w:before="0" w:after="60" w:line="276" w:lineRule="auto"/>
         <w:jc w:val="center"/>
       </w:pPr>
       <w:r>
         <w:rPr>
           <w:rFonts w:ascii="宋体" w:hAnsi="宋体" w:eastAsia="宋体"/>
           <w:b/>
-          <w:color w:val="0F5F8A"/>
-          <w:sz w:val="30"/>
+          <w:sz w:val="28"/>
         </w:rPr>
         <w:t>第一单元 · 大数的认识 · 参考答案</w:t>
       </w:r>
     </w:p>
     <w:p>
       <w:pPr>
-        <w:spacing w:before="0" w:after="160" w:line="240" w:lineRule="auto"/>
+        <w:spacing w:before="0" w:after="160" w:line="276" w:lineRule="auto"/>
         <w:jc w:val="center"/>
       </w:pPr>
       <w:r>
         <w:rPr>
           <w:rFonts w:ascii="宋体" w:hAnsi="宋体" w:eastAsia="宋体"/>
           <w:b w:val="0"/>
-          <w:sz w:val="20"/>
+          <w:sz w:val="18"/>
         </w:rPr>
         <w:t>单独答案页 · 可只打印这一页</w:t>
       </w:r>
     </w:p>
     <w:p>
       <w:pPr>
-        <w:spacing w:before="100" w:after="60" w:line="240" w:lineRule="auto"/>
+        <w:spacing w:before="80" w:after="40" w:line="276" w:lineRule="auto"/>
       </w:pPr>
       <w:r>
         <w:rPr>
           <w:rFonts w:ascii="宋体" w:hAnsi="宋体" w:eastAsia="宋体"/>
           <w:b/>
-          <w:color w:val="0F5F8A"/>
-          <w:sz w:val="24"/>
+          <w:sz w:val="22"/>
         </w:rPr>
         <w:t>四上 · 第一单元 · 大数的认识 · 参考答案</w:t>
       </w:r>
     </w:p>
     <w:p>
       <w:pPr>
-        <w:spacing w:before="100" w:after="60" w:line="240" w:lineRule="auto"/>
+        <w:spacing w:before="80" w:after="40" w:line="276" w:lineRule="auto"/>
       </w:pPr>
       <w:r>
         <w:rPr>
           <w:rFonts w:ascii="宋体" w:hAnsi="宋体" w:eastAsia="宋体"/>
           <w:b/>
-          <w:color w:val="0F5F8A"/>
-          <w:sz w:val="24"/>
+          <w:sz w:val="22"/>
         </w:rPr>
         <w:t>一、填空</w:t>
       </w:r>
     </w:p>
     <w:p>
       <w:pPr>
-        <w:spacing w:before="0" w:after="40" w:line="240" w:lineRule="auto"/>
+        <w:spacing w:before="0" w:after="20" w:line="276" w:lineRule="auto"/>
       </w:pPr>
       <w:r>
         <w:rPr>
           <w:rFonts w:ascii="宋体" w:hAnsi="宋体" w:eastAsia="宋体"/>
           <w:b w:val="0"/>
-          <w:sz w:val="20"/>
+          <w:sz w:val="19"/>
         </w:rPr>
         <w:t>1. 十万；一千万；100；100</w:t>
       </w:r>
     </w:p>
     <w:p>
       <w:pPr>
-        <w:spacing w:before="0" w:after="40" w:line="240" w:lineRule="auto"/>
+        <w:spacing w:before="0" w:after="20" w:line="276" w:lineRule="auto"/>
       </w:pPr>
       <w:r>
         <w:rPr>
           <w:rFonts w:ascii="宋体" w:hAnsi="宋体" w:eastAsia="宋体"/>
           <w:b w:val="0"/>
-          <w:sz w:val="20"/>
+          <w:sz w:val="19"/>
         </w:rPr>
         <w:t>2. ＜；＞；＝；＜</w:t>
       </w:r>
     </w:p>
     <w:p>
       <w:pPr>
-        <w:spacing w:before="0" w:after="40" w:line="240" w:lineRule="auto"/>
+        <w:spacing w:before="0" w:after="20" w:line="276" w:lineRule="auto"/>
       </w:pPr>
       <w:r>
         <w:rPr>
           <w:rFonts w:ascii="宋体" w:hAnsi="宋体" w:eastAsia="宋体"/>
           <w:b w:val="0"/>
-          <w:sz w:val="20"/>
+          <w:sz w:val="19"/>
         </w:rPr>
         <w:t xml:space="preserve">   （5430079＜5430790；1010100＞110100；48万＝480000；6299000＜630万）</w:t>
       </w:r>
     </w:p>
     <w:p>
       <w:pPr>
-        <w:spacing w:before="0" w:after="40" w:line="240" w:lineRule="auto"/>
+        <w:spacing w:before="0" w:after="20" w:line="276" w:lineRule="auto"/>
       </w:pPr>
       <w:r>
         <w:rPr>
           <w:rFonts w:ascii="宋体" w:hAnsi="宋体" w:eastAsia="宋体"/>
           <w:b w:val="0"/>
-          <w:sz w:val="20"/>
+          <w:sz w:val="19"/>
         </w:rPr>
         <w:t>3. 读作：一万一千零三十四；由 1 个万和 1034 个一组成</w:t>
       </w:r>
     </w:p>
     <w:p>
       <w:pPr>
-        <w:spacing w:before="0" w:after="40" w:line="240" w:lineRule="auto"/>
+        <w:spacing w:before="0" w:after="20" w:line="276" w:lineRule="auto"/>
       </w:pPr>
       <w:r>
         <w:rPr>
           <w:rFonts w:ascii="宋体" w:hAnsi="宋体" w:eastAsia="宋体"/>
           <w:b w:val="0"/>
-          <w:sz w:val="20"/>
+          <w:sz w:val="19"/>
         </w:rPr>
         <w:t>4. 100000000（一亿）；9 位数；最高位在 亿 位</w:t>
       </w:r>
     </w:p>
     <w:p>
       <w:pPr>
-        <w:spacing w:before="0" w:after="40" w:line="240" w:lineRule="auto"/>
+        <w:spacing w:before="0" w:after="20" w:line="276" w:lineRule="auto"/>
       </w:pPr>
       <w:r>
         <w:rPr>
           <w:rFonts w:ascii="宋体" w:hAnsi="宋体" w:eastAsia="宋体"/>
           <w:b w:val="0"/>
-          <w:sz w:val="20"/>
+          <w:sz w:val="19"/>
         </w:rPr>
         <w:t>5. 写作：384400；约是 38 万千米</w:t>
       </w:r>
     </w:p>
     <w:p>
       <w:pPr>
-        <w:spacing w:before="0" w:after="40" w:line="240" w:lineRule="auto"/>
+        <w:spacing w:before="0" w:after="20" w:line="276" w:lineRule="auto"/>
       </w:pPr>
       <w:r>
         <w:rPr>
           <w:rFonts w:ascii="宋体" w:hAnsi="宋体" w:eastAsia="宋体"/>
           <w:b w:val="0"/>
-          <w:sz w:val="20"/>
+          <w:sz w:val="19"/>
         </w:rPr>
         <w:t>6. 万级的 8 表示 8 个十万（或 800000）；个级的 8 表示 8 个百（或 800）</w:t>
       </w:r>
     </w:p>
     <w:p>
       <w:pPr>
-        <w:spacing w:before="0" w:after="40" w:line="240" w:lineRule="auto"/>
+        <w:spacing w:before="0" w:after="20" w:line="276" w:lineRule="auto"/>
       </w:pPr>
       <w:r>
         <w:rPr>
           <w:rFonts w:ascii="宋体" w:hAnsi="宋体" w:eastAsia="宋体"/>
           <w:b w:val="0"/>
-          <w:sz w:val="20"/>
+          <w:sz w:val="19"/>
         </w:rPr>
         <w:t>7. 8□989≈8万：□可填 0、1、2、3、4（四舍五入看千位，千位≤4）</w:t>
       </w:r>
     </w:p>
     <w:p>
       <w:pPr>
-        <w:spacing w:before="0" w:after="40" w:line="240" w:lineRule="auto"/>
+        <w:spacing w:before="0" w:after="20" w:line="276" w:lineRule="auto"/>
       </w:pPr>
       <w:r>
         <w:rPr>
           <w:rFonts w:ascii="宋体" w:hAnsi="宋体" w:eastAsia="宋体"/>
           <w:b w:val="0"/>
-          <w:sz w:val="20"/>
+          <w:sz w:val="19"/>
         </w:rPr>
         <w:t xml:space="preserve">   10□0074000≈11亿：□可填 5、6、7、8、9（向「亿」省略尾数/四舍五入到亿位时进上去）</w:t>
       </w:r>
     </w:p>
     <w:p>
       <w:pPr>
-        <w:spacing w:before="0" w:after="40" w:line="240" w:lineRule="auto"/>
+        <w:spacing w:before="0" w:after="20" w:line="276" w:lineRule="auto"/>
       </w:pPr>
       <w:r>
         <w:rPr>
           <w:rFonts w:ascii="宋体" w:hAnsi="宋体" w:eastAsia="宋体"/>
           <w:b w:val="0"/>
-          <w:sz w:val="20"/>
+          <w:sz w:val="19"/>
         </w:rPr>
         <w:t>8. 最接近 35 亿：□填 0；最接近 36 亿：□填 9</w:t>
       </w:r>
     </w:p>
     <w:p>
       <w:pPr>
-        <w:spacing w:before="0" w:after="40" w:line="240" w:lineRule="auto"/>
+        <w:spacing w:before="0" w:after="20" w:line="276" w:lineRule="auto"/>
       </w:pPr>
       <w:r>
         <w:rPr>
           <w:rFonts w:ascii="宋体" w:hAnsi="宋体" w:eastAsia="宋体"/>
           <w:b w:val="0"/>
-          <w:sz w:val="20"/>
+          <w:sz w:val="19"/>
         </w:rPr>
         <w:t>9. 算盘表示的数：530000（53 万；数线为 50万–60万）</w:t>
       </w:r>
     </w:p>
     <w:p>
       <w:pPr>
-        <w:spacing w:before="0" w:after="40" w:line="240" w:lineRule="auto"/>
+        <w:spacing w:before="0" w:after="20" w:line="276" w:lineRule="auto"/>
       </w:pPr>
       <w:r>
         <w:rPr>
           <w:rFonts w:ascii="宋体" w:hAnsi="宋体" w:eastAsia="宋体"/>
           <w:b w:val="0"/>
-          <w:sz w:val="20"/>
+          <w:sz w:val="19"/>
         </w:rPr>
         <w:t xml:space="preserve">   数线上用 ↑ 标在 53万 刻度（50万后第 3 小格）</w:t>
       </w:r>
     </w:p>
     <w:p>
       <w:pPr>
-        <w:spacing w:before="0" w:after="40" w:line="240" w:lineRule="auto"/>
+        <w:spacing w:before="0" w:after="20" w:line="276" w:lineRule="auto"/>
       </w:pPr>
       <w:r>
         <w:rPr>
           <w:rFonts w:ascii="宋体" w:hAnsi="宋体" w:eastAsia="宋体"/>
           <w:b w:val="0"/>
-          <w:sz w:val="20"/>
+          <w:sz w:val="19"/>
         </w:rPr>
         <w:t xml:space="preserve">   &gt; 珠档以实图为准；落在 50万–60万之间才能与数线一致。</w:t>
       </w:r>
     </w:p>
     <w:p>
       <w:pPr>
-        <w:spacing w:before="0" w:after="40" w:line="240" w:lineRule="auto"/>
+        <w:spacing w:before="0" w:after="20" w:line="276" w:lineRule="auto"/>
       </w:pPr>
       <w:r>
         <w:rPr>
           <w:rFonts w:ascii="宋体" w:hAnsi="宋体" w:eastAsia="宋体"/>
           <w:b w:val="0"/>
-          <w:sz w:val="20"/>
+          <w:sz w:val="19"/>
         </w:rPr>
         <w:t>10. 11 颗珠、每位至少 1 颗 → 最大五位数：71111</w:t>
       </w:r>
     </w:p>
     <w:p>
       <w:pPr>
-        <w:spacing w:before="100" w:after="60" w:line="240" w:lineRule="auto"/>
+        <w:spacing w:before="80" w:after="40" w:line="276" w:lineRule="auto"/>
       </w:pPr>
       <w:r>
         <w:rPr>
           <w:rFonts w:ascii="宋体" w:hAnsi="宋体" w:eastAsia="宋体"/>
           <w:b/>
-          <w:color w:val="0F5F8A"/>
-          <w:sz w:val="24"/>
+          <w:sz w:val="22"/>
         </w:rPr>
         <w:t>二、选一选</w:t>
       </w:r>
     </w:p>
     <w:p>
       <w:pPr>
-        <w:spacing w:before="0" w:after="40" w:line="240" w:lineRule="auto"/>
+        <w:spacing w:before="0" w:after="20" w:line="276" w:lineRule="auto"/>
       </w:pPr>
       <w:r>
         <w:rPr>
           <w:rFonts w:ascii="宋体" w:hAnsi="宋体" w:eastAsia="宋体"/>
           <w:b w:val="0"/>
-          <w:sz w:val="20"/>
+          <w:sz w:val="19"/>
         </w:rPr>
         <w:t>1. ②（543100 中的 3 在千位 → 3 个一千）</w:t>
       </w:r>
     </w:p>
     <w:p>
       <w:pPr>
-        <w:spacing w:before="0" w:after="40" w:line="240" w:lineRule="auto"/>
+        <w:spacing w:before="0" w:after="20" w:line="276" w:lineRule="auto"/>
       </w:pPr>
       <w:r>
         <w:rPr>
           <w:rFonts w:ascii="宋体" w:hAnsi="宋体" w:eastAsia="宋体"/>
           <w:b w:val="0"/>
-          <w:sz w:val="20"/>
+          <w:sz w:val="19"/>
         </w:rPr>
         <w:t>2. ② 4060273（万级 406，个级 273）</w:t>
       </w:r>
     </w:p>
     <w:p>
       <w:pPr>
-        <w:spacing w:before="0" w:after="40" w:line="240" w:lineRule="auto"/>
+        <w:spacing w:before="0" w:after="20" w:line="276" w:lineRule="auto"/>
       </w:pPr>
       <w:r>
         <w:rPr>
           <w:rFonts w:ascii="宋体" w:hAnsi="宋体" w:eastAsia="宋体"/>
           <w:b w:val="0"/>
-          <w:sz w:val="20"/>
+          <w:sz w:val="19"/>
         </w:rPr>
         <w:t>3. ③ 6 个 0（四千万零七 → 40000007；4 与 7 之间六个 0）</w:t>
       </w:r>
     </w:p>
     <w:p>
       <w:pPr>
-        <w:spacing w:before="0" w:after="40" w:line="240" w:lineRule="auto"/>
+        <w:spacing w:before="0" w:after="20" w:line="276" w:lineRule="auto"/>
       </w:pPr>
       <w:r>
         <w:rPr>
           <w:rFonts w:ascii="宋体" w:hAnsi="宋体" w:eastAsia="宋体"/>
           <w:b w:val="0"/>
-          <w:sz w:val="20"/>
+          <w:sz w:val="19"/>
         </w:rPr>
         <w:t xml:space="preserve">   &gt; 已对照第 2 页原文「四千万零七」，不是「四十万零七」。</w:t>
       </w:r>
     </w:p>
     <w:p>
       <w:pPr>
-        <w:spacing w:before="0" w:after="40" w:line="240" w:lineRule="auto"/>
+        <w:spacing w:before="0" w:after="20" w:line="276" w:lineRule="auto"/>
       </w:pPr>
       <w:r>
         <w:rPr>
           <w:rFonts w:ascii="宋体" w:hAnsi="宋体" w:eastAsia="宋体"/>
           <w:b w:val="0"/>
-          <w:sz w:val="20"/>
+          <w:sz w:val="19"/>
         </w:rPr>
         <w:t>4. ③ 不正确（数线若指在 10万与 20万正中≈15万，不能表示 12万；以卷面图为准）</w:t>
       </w:r>
     </w:p>
     <w:p>
       <w:pPr>
-        <w:spacing w:before="0" w:after="40" w:line="240" w:lineRule="auto"/>
+        <w:spacing w:before="0" w:after="20" w:line="276" w:lineRule="auto"/>
       </w:pPr>
       <w:r>
         <w:rPr>
           <w:rFonts w:ascii="宋体" w:hAnsi="宋体" w:eastAsia="宋体"/>
           <w:b w:val="0"/>
-          <w:sz w:val="20"/>
+          <w:sz w:val="19"/>
         </w:rPr>
         <w:t xml:space="preserve">   &gt; 核对：①算盘 12万 ✓；②每格 1000×120 格＝120000 ✓；④展开式 ✓</w:t>
       </w:r>
     </w:p>
     <w:p>
       <w:pPr>
-        <w:spacing w:before="0" w:after="40" w:line="240" w:lineRule="auto"/>
+        <w:spacing w:before="0" w:after="20" w:line="276" w:lineRule="auto"/>
       </w:pPr>
       <w:r>
         <w:rPr>
           <w:rFonts w:ascii="宋体" w:hAnsi="宋体" w:eastAsia="宋体"/>
           <w:b w:val="0"/>
-          <w:sz w:val="20"/>
+          <w:sz w:val="19"/>
         </w:rPr>
         <w:t>5. ④ 9（近似数 476万且原数万位为 6，千位最大可为 9）</w:t>
       </w:r>
     </w:p>
     <w:p>
       <w:pPr>
-        <w:spacing w:before="0" w:after="40" w:line="240" w:lineRule="auto"/>
+        <w:spacing w:before="0" w:after="20" w:line="276" w:lineRule="auto"/>
       </w:pPr>
       <w:r>
         <w:rPr>
           <w:rFonts w:ascii="宋体" w:hAnsi="宋体" w:eastAsia="宋体"/>
           <w:b w:val="0"/>
-          <w:sz w:val="20"/>
+          <w:sz w:val="19"/>
         </w:rPr>
         <w:t>6. ① 63000（M 靠近 60000 一侧约 1/3 处；若实图位置不同按实图选）</w:t>
       </w:r>
     </w:p>
     <w:p>
       <w:pPr>
-        <w:spacing w:before="100" w:after="60" w:line="240" w:lineRule="auto"/>
+        <w:spacing w:before="80" w:after="40" w:line="276" w:lineRule="auto"/>
       </w:pPr>
       <w:r>
         <w:rPr>
           <w:rFonts w:ascii="宋体" w:hAnsi="宋体" w:eastAsia="宋体"/>
           <w:b/>
-          <w:color w:val="0F5F8A"/>
-          <w:sz w:val="24"/>
+          <w:sz w:val="22"/>
         </w:rPr>
         <w:t>三、按要求完成</w:t>
       </w:r>
     </w:p>
     <w:p>
       <w:pPr>
-        <w:spacing w:before="0" w:after="40" w:line="240" w:lineRule="auto"/>
+        <w:spacing w:before="0" w:after="20" w:line="276" w:lineRule="auto"/>
       </w:pPr>
       <w:r>
         <w:rPr>
           <w:rFonts w:ascii="宋体" w:hAnsi="宋体" w:eastAsia="宋体"/>
           <w:b w:val="0"/>
-          <w:sz w:val="20"/>
+          <w:sz w:val="19"/>
         </w:rPr>
         <w:t>1. 连一连（读 0 的个数）</w:t>
       </w:r>
     </w:p>
     <w:p>
       <w:pPr>
-        <w:spacing w:before="0" w:after="40" w:line="240" w:lineRule="auto"/>
+        <w:spacing w:before="0" w:after="20" w:line="276" w:lineRule="auto"/>
       </w:pPr>
       <w:r>
         <w:rPr>
           <w:rFonts w:ascii="宋体" w:hAnsi="宋体" w:eastAsia="宋体"/>
           <w:b w:val="0"/>
-          <w:sz w:val="20"/>
+          <w:sz w:val="19"/>
         </w:rPr>
         <w:t xml:space="preserve">   - 一个 0 都不读：87025000（八千七百零二万五千）</w:t>
       </w:r>
     </w:p>
     <w:p>
       <w:pPr>
-        <w:spacing w:before="0" w:after="40" w:line="240" w:lineRule="auto"/>
+        <w:spacing w:before="0" w:after="20" w:line="276" w:lineRule="auto"/>
       </w:pPr>
       <w:r>
         <w:rPr>
           <w:rFonts w:ascii="宋体" w:hAnsi="宋体" w:eastAsia="宋体"/>
           <w:b w:val="0"/>
-          <w:sz w:val="20"/>
+          <w:sz w:val="19"/>
         </w:rPr>
         <w:t xml:space="preserve">   - 读出一个 0：80072050、87205000</w:t>
       </w:r>
     </w:p>
     <w:p>
       <w:pPr>
-        <w:spacing w:before="0" w:after="40" w:line="240" w:lineRule="auto"/>
+        <w:spacing w:before="0" w:after="20" w:line="276" w:lineRule="auto"/>
       </w:pPr>
       <w:r>
         <w:rPr>
           <w:rFonts w:ascii="宋体" w:hAnsi="宋体" w:eastAsia="宋体"/>
           <w:b w:val="0"/>
-          <w:sz w:val="20"/>
+          <w:sz w:val="19"/>
         </w:rPr>
         <w:t xml:space="preserve">   - 读出两个 0：80700025</w:t>
       </w:r>
     </w:p>
     <w:p>
       <w:pPr>
-        <w:spacing w:before="0" w:after="40" w:line="240" w:lineRule="auto"/>
+        <w:spacing w:before="0" w:after="20" w:line="276" w:lineRule="auto"/>
       </w:pPr>
       <w:r>
         <w:rPr>
           <w:rFonts w:ascii="宋体" w:hAnsi="宋体" w:eastAsia="宋体"/>
           <w:b w:val="0"/>
-          <w:sz w:val="20"/>
+          <w:sz w:val="19"/>
         </w:rPr>
         <w:t xml:space="preserve">   &gt; 以「读法里出现几个“零”」为准；若学校口径不同，按老师讲义微调。</w:t>
       </w:r>
     </w:p>
     <w:p>
       <w:pPr>
-        <w:spacing w:before="0" w:after="40" w:line="240" w:lineRule="auto"/>
+        <w:spacing w:before="0" w:after="20" w:line="276" w:lineRule="auto"/>
       </w:pPr>
       <w:r>
         <w:rPr>
           <w:rFonts w:ascii="宋体" w:hAnsi="宋体" w:eastAsia="宋体"/>
           <w:b w:val="0"/>
-          <w:sz w:val="20"/>
+          <w:sz w:val="19"/>
         </w:rPr>
         <w:t>2. （1）379614＝100000×3＋10000×7＋1000×9＋100×6＋10×1＋4×1</w:t>
       </w:r>
     </w:p>
     <w:p>
       <w:pPr>
-        <w:spacing w:before="0" w:after="40" w:line="240" w:lineRule="auto"/>
+        <w:spacing w:before="0" w:after="20" w:line="276" w:lineRule="auto"/>
       </w:pPr>
       <w:r>
         <w:rPr>
           <w:rFonts w:ascii="宋体" w:hAnsi="宋体" w:eastAsia="宋体"/>
           <w:b w:val="0"/>
-          <w:sz w:val="20"/>
+          <w:sz w:val="19"/>
         </w:rPr>
         <w:t xml:space="preserve">   （2）数线上两空：约 55000；约 63000（按刻度位置，以实图为准）</w:t>
       </w:r>
     </w:p>
     <w:p>
       <w:pPr>
-        <w:spacing w:before="0" w:after="40" w:line="240" w:lineRule="auto"/>
+        <w:spacing w:before="0" w:after="20" w:line="276" w:lineRule="auto"/>
       </w:pPr>
       <w:r>
         <w:rPr>
           <w:rFonts w:ascii="宋体" w:hAnsi="宋体" w:eastAsia="宋体"/>
           <w:b w:val="0"/>
-          <w:sz w:val="20"/>
+          <w:sz w:val="19"/>
         </w:rPr>
         <w:t>3. 从大到小：木星 → 地球 → 金星 → 水星</w:t>
       </w:r>
     </w:p>
     <w:p>
       <w:pPr>
-        <w:spacing w:before="0" w:after="40" w:line="240" w:lineRule="auto"/>
+        <w:spacing w:before="0" w:after="20" w:line="276" w:lineRule="auto"/>
       </w:pPr>
       <w:r>
         <w:rPr>
           <w:rFonts w:ascii="宋体" w:hAnsi="宋体" w:eastAsia="宋体"/>
           <w:b w:val="0"/>
-          <w:sz w:val="20"/>
+          <w:sz w:val="19"/>
         </w:rPr>
         <w:t xml:space="preserve">   778330000 → 149600000 → 108200000 → 57910000</w:t>
       </w:r>
     </w:p>
     <w:p>
       <w:pPr>
-        <w:spacing w:before="100" w:after="60" w:line="240" w:lineRule="auto"/>
+        <w:spacing w:before="80" w:after="40" w:line="276" w:lineRule="auto"/>
       </w:pPr>
       <w:r>
         <w:rPr>
           <w:rFonts w:ascii="宋体" w:hAnsi="宋体" w:eastAsia="宋体"/>
           <w:b/>
-          <w:color w:val="0F5F8A"/>
-          <w:sz w:val="24"/>
+          <w:sz w:val="22"/>
         </w:rPr>
         <w:t>四、列竖式计算</w:t>
       </w:r>
     </w:p>
     <w:p>
       <w:pPr>
-        <w:spacing w:before="0" w:after="40" w:line="240" w:lineRule="auto"/>
+        <w:spacing w:before="0" w:after="20" w:line="276" w:lineRule="auto"/>
       </w:pPr>
       <w:r>
         <w:rPr>
           <w:rFonts w:ascii="宋体" w:hAnsi="宋体" w:eastAsia="宋体"/>
           <w:b w:val="0"/>
-          <w:sz w:val="20"/>
+          <w:sz w:val="19"/>
         </w:rPr>
         <w:t>1. 76×45＝3420</w:t>
       </w:r>
     </w:p>
     <w:p>
       <w:pPr>
-        <w:spacing w:before="0" w:after="40" w:line="240" w:lineRule="auto"/>
+        <w:spacing w:before="0" w:after="20" w:line="276" w:lineRule="auto"/>
       </w:pPr>
       <w:r>
         <w:rPr>
           <w:rFonts w:ascii="宋体" w:hAnsi="宋体" w:eastAsia="宋体"/>
           <w:b w:val="0"/>
-          <w:sz w:val="20"/>
+          <w:sz w:val="19"/>
         </w:rPr>
         <w:t>2. 21.4－7.9＝13.5（卷面如此；若你们学期尚未学小数，可标为「超前题」）</w:t>
       </w:r>
     </w:p>
     <w:p>
       <w:pPr>
-        <w:spacing w:before="0" w:after="40" w:line="240" w:lineRule="auto"/>
+        <w:spacing w:before="0" w:after="20" w:line="276" w:lineRule="auto"/>
       </w:pPr>
       <w:r>
         <w:rPr>
           <w:rFonts w:ascii="宋体" w:hAnsi="宋体" w:eastAsia="宋体"/>
           <w:b w:val="0"/>
-          <w:sz w:val="20"/>
+          <w:sz w:val="19"/>
         </w:rPr>
         <w:t>3. 572÷7＝81……5（或 81 余 5）</w:t>
       </w:r>
     </w:p>
     <w:p>
       <w:pPr>
-        <w:spacing w:before="0" w:after="40" w:line="240" w:lineRule="auto"/>
+        <w:spacing w:before="0" w:after="20" w:line="276" w:lineRule="auto"/>
       </w:pPr>
       <w:r>
         <w:rPr>
           <w:rFonts w:ascii="宋体" w:hAnsi="宋体" w:eastAsia="宋体"/>
           <w:b w:val="0"/>
-          <w:sz w:val="20"/>
+          <w:sz w:val="19"/>
         </w:rPr>
         <w:t>4. ※843÷5＝168……3（验算：168×5＋3＝843）</w:t>
       </w:r>
     </w:p>
     <w:p>
       <w:pPr>
-        <w:spacing w:before="100" w:after="60" w:line="240" w:lineRule="auto"/>
+        <w:spacing w:before="80" w:after="40" w:line="276" w:lineRule="auto"/>
       </w:pPr>
       <w:r>
         <w:rPr>
           <w:rFonts w:ascii="宋体" w:hAnsi="宋体" w:eastAsia="宋体"/>
           <w:b/>
-          <w:color w:val="0F5F8A"/>
-          <w:sz w:val="24"/>
+          <w:sz w:val="22"/>
         </w:rPr>
         <w:t>五、根据短文</w:t>
       </w:r>
     </w:p>
     <w:p>
       <w:pPr>
-        <w:spacing w:before="0" w:after="40" w:line="240" w:lineRule="auto"/>
+        <w:spacing w:before="0" w:after="20" w:line="276" w:lineRule="auto"/>
       </w:pPr>
       <w:r>
         <w:rPr>
           <w:rFonts w:ascii="宋体" w:hAnsi="宋体" w:eastAsia="宋体"/>
           <w:b w:val="0"/>
-          <w:sz w:val="20"/>
+          <w:sz w:val="19"/>
         </w:rPr>
         <w:t>1. 2267000000 读作：二十二亿六千七百万</w:t>
       </w:r>
     </w:p>
     <w:p>
       <w:pPr>
-        <w:spacing w:before="0" w:after="40" w:line="240" w:lineRule="auto"/>
+        <w:spacing w:before="0" w:after="20" w:line="276" w:lineRule="auto"/>
       </w:pPr>
       <w:r>
         <w:rPr>
           <w:rFonts w:ascii="宋体" w:hAnsi="宋体" w:eastAsia="宋体"/>
           <w:b w:val="0"/>
-          <w:sz w:val="20"/>
+          <w:sz w:val="19"/>
         </w:rPr>
         <w:t xml:space="preserve">   左边的 2 在 十亿 位，表示 2 个十亿；右边的 2 在 千万 位，表示 2 个千万</w:t>
       </w:r>
     </w:p>
     <w:p>
       <w:pPr>
-        <w:spacing w:before="0" w:after="40" w:line="240" w:lineRule="auto"/>
+        <w:spacing w:before="0" w:after="20" w:line="276" w:lineRule="auto"/>
       </w:pPr>
       <w:r>
         <w:rPr>
           <w:rFonts w:ascii="宋体" w:hAnsi="宋体" w:eastAsia="宋体"/>
           <w:b w:val="0"/>
-          <w:sz w:val="20"/>
+          <w:sz w:val="19"/>
         </w:rPr>
         <w:t xml:space="preserve">   258000 省略万后面的尾数约 26 万</w:t>
       </w:r>
     </w:p>
     <w:p>
       <w:pPr>
-        <w:spacing w:before="0" w:after="40" w:line="240" w:lineRule="auto"/>
+        <w:spacing w:before="0" w:after="20" w:line="276" w:lineRule="auto"/>
       </w:pPr>
       <w:r>
         <w:rPr>
           <w:rFonts w:ascii="宋体" w:hAnsi="宋体" w:eastAsia="宋体"/>
           <w:b w:val="0"/>
-          <w:sz w:val="20"/>
+          <w:sz w:val="19"/>
         </w:rPr>
         <w:t>2. 「约 91000 人」→ ② 近似数；「9 枚金牌」→ ① 准确数</w:t>
       </w:r>
     </w:p>
     <w:p>
       <w:pPr>
-        <w:spacing w:before="0" w:after="40" w:line="240" w:lineRule="auto"/>
+        <w:spacing w:before="0" w:after="20" w:line="276" w:lineRule="auto"/>
       </w:pPr>
       <w:r>
         <w:rPr>
           <w:rFonts w:ascii="宋体" w:hAnsi="宋体" w:eastAsia="宋体"/>
           <w:b w:val="0"/>
-          <w:sz w:val="20"/>
+          <w:sz w:val="19"/>
         </w:rPr>
         <w:t>3. 约 3 亿（四舍五入）：最大可到 349999999（不足 3.5 亿则仍约成 3 亿）</w:t>
       </w:r>
     </w:p>
     <w:p>
       <w:pPr>
-        <w:spacing w:before="0" w:after="40" w:line="240" w:lineRule="auto"/>
+        <w:spacing w:before="0" w:after="20" w:line="276" w:lineRule="auto"/>
       </w:pPr>
       <w:r>
         <w:rPr>
           <w:rFonts w:ascii="宋体" w:hAnsi="宋体" w:eastAsia="宋体"/>
           <w:b w:val="0"/>
-          <w:sz w:val="20"/>
+          <w:sz w:val="19"/>
         </w:rPr>
         <w:t xml:space="preserve">   思路：亿位后下一位是「千万位」，＜5 不进，故最大为 3 亿 4 千多万……</w:t>
       </w:r>
     </w:p>
     <w:p>
       <w:pPr>
-        <w:spacing w:before="100" w:after="60" w:line="240" w:lineRule="auto"/>
+        <w:spacing w:before="80" w:after="40" w:line="276" w:lineRule="auto"/>
       </w:pPr>
       <w:r>
         <w:rPr>
           <w:rFonts w:ascii="宋体" w:hAnsi="宋体" w:eastAsia="宋体"/>
           <w:b/>
-          <w:color w:val="0F5F8A"/>
-          <w:sz w:val="24"/>
+          <w:sz w:val="22"/>
         </w:rPr>
         <w:t>入库说明</w:t>
       </w:r>
     </w:p>
     <w:p>
       <w:pPr>
-        <w:spacing w:before="0" w:after="40" w:line="240" w:lineRule="auto"/>
+        <w:spacing w:before="0" w:after="20" w:line="276" w:lineRule="auto"/>
       </w:pPr>
       <w:r>
         <w:rPr>
           <w:rFonts w:ascii="宋体" w:hAnsi="宋体" w:eastAsia="宋体"/>
           <w:b w:val="0"/>
-          <w:sz w:val="20"/>
+          <w:sz w:val="19"/>
         </w:rPr>
         <w:t>- 打印卷：printables/unit-tests/U1_四上_第一单元_大数的认识.pdf（及 .docx）</w:t>
       </w:r>
     </w:p>
     <w:p>
       <w:pPr>
-        <w:spacing w:before="0" w:after="40" w:line="240" w:lineRule="auto"/>
+        <w:spacing w:before="0" w:after="20" w:line="276" w:lineRule="auto"/>
       </w:pPr>
       <w:r>
         <w:rPr>
           <w:rFonts w:ascii="宋体" w:hAnsi="宋体" w:eastAsia="宋体"/>
           <w:b w:val="0"/>
-          <w:sz w:val="20"/>
+          <w:sz w:val="19"/>
         </w:rPr>
         <w:t>- 源图：_source/unit-tests/U1-1.png、U1-2.png</w:t>
       </w:r>
     </w:p>
     <w:sectPr>
       <w:pgSz w:w="11906" w:h="16838"/>
-      <w:pgMar w:top="794" w:right="1020" w:bottom="794" w:left="1020" w:header="720" w:footer="720" w:gutter="0"/>
+      <w:pgMar w:top="624" w:right="850" w:bottom="624" w:left="850" w:header="720" w:footer="720" w:gutter="0"/>
       <w:cols w:space="720"/>
       <w:docGrid w:linePitch="360"/>
     </w:sectPr>
@@ -1063,7 +1055,7 @@
     <w:rsid w:val="00FC693F"/>
     <w:rPr>
       <w:rFonts w:ascii="宋体" w:hAnsi="宋体" w:eastAsia="宋体"/>
-      <w:sz w:val="22"/>
+      <w:sz w:val="21"/>
     </w:rPr>
   </w:style>
   <w:style w:type="paragraph" w:styleId="Header">

</xml_diff>